<commit_message>
docs: SRS v1.3 — table header rows stay with their tables and repeat on each page
Checked every page of the SRS as images. The "Tool | Purpose" header of
1.7.2 sat alone at the foot of a page with its table on the next. Every
table's first row is now a header row: it cannot split, it keeps with
the row after it, and it repeats at the top of a continued page — so a
requirement table that runs onto a second page shows which FR it is.
Text unchanged; 37 pages; the OOXML validator passes.

Co-Authored-By: Claude Opus 5.5 <noreply@anthropic.com>
Claude-Session: https://claude.ai/code/session_01W8wmujvWTurC6UV9VHP9AX
</commit_message>
<xml_diff>
--- a/docs/Sufria_SRS_Chapters_1_2_v1.3.docx
+++ b/docs/Sufria_SRS_Chapters_1_2_v1.3.docx
@@ -68,6 +68,10 @@
         <w:gridCol w:w="6300"/>
       </w:tblGrid>
       <w:tr>
+        <w:trPr>
+          <w:cantSplit/>
+          <w:tblHeader/>
+        </w:trPr>
         <w:tc>
           <w:tcPr>
             <w:tcW w:type="dxa" w:w="3000"/>
@@ -81,6 +85,7 @@
           </w:tcPr>
           <w:p>
             <w:pPr>
+              <w:keepNext/>
               <w:spacing w:after="0" w:line="260"/>
             </w:pPr>
             <w:r>
@@ -107,6 +112,7 @@
           </w:tcPr>
           <w:p>
             <w:pPr>
+              <w:keepNext/>
               <w:spacing w:after="0" w:line="260"/>
             </w:pPr>
             <w:r>
@@ -697,6 +703,10 @@
         <w:gridCol w:w="3000"/>
       </w:tblGrid>
       <w:tr>
+        <w:trPr>
+          <w:cantSplit/>
+          <w:tblHeader/>
+        </w:trPr>
         <w:tc>
           <w:tcPr>
             <w:tcW w:type="dxa" w:w="1700"/>
@@ -710,6 +720,7 @@
           </w:tcPr>
           <w:p>
             <w:pPr>
+              <w:keepNext/>
               <w:spacing w:after="0" w:line="260"/>
             </w:pPr>
             <w:r>
@@ -738,6 +749,7 @@
           </w:tcPr>
           <w:p>
             <w:pPr>
+              <w:keepNext/>
               <w:spacing w:after="0" w:line="260"/>
             </w:pPr>
             <w:r>
@@ -766,6 +778,7 @@
           </w:tcPr>
           <w:p>
             <w:pPr>
+              <w:keepNext/>
               <w:spacing w:after="0" w:line="260"/>
             </w:pPr>
             <w:r>
@@ -1514,6 +1527,10 @@
         <w:gridCol w:w="3000"/>
       </w:tblGrid>
       <w:tr>
+        <w:trPr>
+          <w:cantSplit/>
+          <w:tblHeader/>
+        </w:trPr>
         <w:tc>
           <w:tcPr>
             <w:tcW w:type="dxa" w:w="1700"/>
@@ -1527,6 +1544,7 @@
           </w:tcPr>
           <w:p>
             <w:pPr>
+              <w:keepNext/>
               <w:spacing w:after="0" w:line="260"/>
             </w:pPr>
             <w:r>
@@ -1555,6 +1573,7 @@
           </w:tcPr>
           <w:p>
             <w:pPr>
+              <w:keepNext/>
               <w:spacing w:after="0" w:line="260"/>
             </w:pPr>
             <w:r>
@@ -1583,6 +1602,7 @@
           </w:tcPr>
           <w:p>
             <w:pPr>
+              <w:keepNext/>
               <w:spacing w:after="0" w:line="260"/>
             </w:pPr>
             <w:r>
@@ -2391,6 +2411,10 @@
         <w:gridCol w:w="900"/>
       </w:tblGrid>
       <w:tr>
+        <w:trPr>
+          <w:cantSplit/>
+          <w:tblHeader/>
+        </w:trPr>
         <w:tc>
           <w:tcPr>
             <w:tcW w:type="dxa" w:w="1500"/>
@@ -2404,6 +2428,7 @@
           </w:tcPr>
           <w:p>
             <w:pPr>
+              <w:keepNext/>
               <w:spacing w:after="0" w:line="260"/>
             </w:pPr>
             <w:r>
@@ -2432,6 +2457,7 @@
           </w:tcPr>
           <w:p>
             <w:pPr>
+              <w:keepNext/>
               <w:spacing w:after="0" w:line="260"/>
             </w:pPr>
             <w:r>
@@ -2460,6 +2486,7 @@
           </w:tcPr>
           <w:p>
             <w:pPr>
+              <w:keepNext/>
               <w:spacing w:after="0" w:line="260"/>
             </w:pPr>
             <w:r>
@@ -2488,6 +2515,7 @@
           </w:tcPr>
           <w:p>
             <w:pPr>
+              <w:keepNext/>
               <w:spacing w:after="0" w:line="260"/>
             </w:pPr>
             <w:r>
@@ -2516,6 +2544,7 @@
           </w:tcPr>
           <w:p>
             <w:pPr>
+              <w:keepNext/>
               <w:spacing w:after="0" w:line="260"/>
             </w:pPr>
             <w:r>
@@ -4284,6 +4313,10 @@
         <w:gridCol w:w="6700"/>
       </w:tblGrid>
       <w:tr>
+        <w:trPr>
+          <w:cantSplit/>
+          <w:tblHeader/>
+        </w:trPr>
         <w:tc>
           <w:tcPr>
             <w:tcW w:type="dxa" w:w="2600"/>
@@ -4297,6 +4330,7 @@
           </w:tcPr>
           <w:p>
             <w:pPr>
+              <w:keepNext/>
               <w:spacing w:after="0" w:line="260"/>
             </w:pPr>
             <w:r>
@@ -4325,6 +4359,7 @@
           </w:tcPr>
           <w:p>
             <w:pPr>
+              <w:keepNext/>
               <w:spacing w:after="0" w:line="260"/>
             </w:pPr>
             <w:r>
@@ -4813,6 +4848,10 @@
         <w:gridCol w:w="6100"/>
       </w:tblGrid>
       <w:tr>
+        <w:trPr>
+          <w:cantSplit/>
+          <w:tblHeader/>
+        </w:trPr>
         <w:tc>
           <w:tcPr>
             <w:tcW w:type="dxa" w:w="3200"/>
@@ -4826,6 +4865,7 @@
           </w:tcPr>
           <w:p>
             <w:pPr>
+              <w:keepNext/>
               <w:spacing w:after="0" w:line="260"/>
             </w:pPr>
             <w:r>
@@ -4854,6 +4894,7 @@
           </w:tcPr>
           <w:p>
             <w:pPr>
+              <w:keepNext/>
               <w:spacing w:after="0" w:line="260"/>
             </w:pPr>
             <w:r>
@@ -5130,6 +5171,10 @@
         <w:gridCol w:w="6900"/>
       </w:tblGrid>
       <w:tr>
+        <w:trPr>
+          <w:cantSplit/>
+          <w:tblHeader/>
+        </w:trPr>
         <w:tc>
           <w:tcPr>
             <w:tcW w:type="dxa" w:w="2400"/>
@@ -5143,6 +5188,7 @@
           </w:tcPr>
           <w:p>
             <w:pPr>
+              <w:keepNext/>
               <w:spacing w:after="0" w:line="260"/>
             </w:pPr>
             <w:r>
@@ -5171,6 +5217,7 @@
           </w:tcPr>
           <w:p>
             <w:pPr>
+              <w:keepNext/>
               <w:spacing w:after="0" w:line="260"/>
             </w:pPr>
             <w:r>
@@ -6873,6 +6920,10 @@
         <w:gridCol w:w="2100"/>
       </w:tblGrid>
       <w:tr>
+        <w:trPr>
+          <w:cantSplit/>
+          <w:tblHeader/>
+        </w:trPr>
         <w:tc>
           <w:tcPr>
             <w:tcW w:type="dxa" w:w="700"/>
@@ -6886,6 +6937,7 @@
           </w:tcPr>
           <w:p>
             <w:pPr>
+              <w:keepNext/>
               <w:spacing w:after="0" w:line="260"/>
             </w:pPr>
             <w:r>
@@ -6914,6 +6966,7 @@
           </w:tcPr>
           <w:p>
             <w:pPr>
+              <w:keepNext/>
               <w:spacing w:after="0" w:line="260"/>
             </w:pPr>
             <w:r>
@@ -6942,6 +6995,7 @@
           </w:tcPr>
           <w:p>
             <w:pPr>
+              <w:keepNext/>
               <w:spacing w:after="0" w:line="260"/>
             </w:pPr>
             <w:r>
@@ -6970,6 +7024,7 @@
           </w:tcPr>
           <w:p>
             <w:pPr>
+              <w:keepNext/>
               <w:spacing w:after="0" w:line="260"/>
             </w:pPr>
             <w:r>
@@ -6998,6 +7053,7 @@
           </w:tcPr>
           <w:p>
             <w:pPr>
+              <w:keepNext/>
               <w:spacing w:after="0" w:line="260"/>
             </w:pPr>
             <w:r>
@@ -7026,6 +7082,7 @@
           </w:tcPr>
           <w:p>
             <w:pPr>
+              <w:keepNext/>
               <w:spacing w:after="0" w:line="260"/>
             </w:pPr>
             <w:r>
@@ -8456,6 +8513,10 @@
         <w:gridCol w:w="2100"/>
       </w:tblGrid>
       <w:tr>
+        <w:trPr>
+          <w:cantSplit/>
+          <w:tblHeader/>
+        </w:trPr>
         <w:tc>
           <w:tcPr>
             <w:tcW w:type="dxa" w:w="1300"/>
@@ -8469,6 +8530,7 @@
           </w:tcPr>
           <w:p>
             <w:pPr>
+              <w:keepNext/>
               <w:spacing w:after="0" w:line="260"/>
             </w:pPr>
             <w:r>
@@ -8497,6 +8559,7 @@
           </w:tcPr>
           <w:p>
             <w:pPr>
+              <w:keepNext/>
               <w:spacing w:after="0" w:line="260"/>
             </w:pPr>
             <w:r>
@@ -8525,6 +8588,7 @@
           </w:tcPr>
           <w:p>
             <w:pPr>
+              <w:keepNext/>
               <w:spacing w:after="0" w:line="260"/>
             </w:pPr>
             <w:r>
@@ -8553,6 +8617,7 @@
           </w:tcPr>
           <w:p>
             <w:pPr>
+              <w:keepNext/>
               <w:spacing w:after="0" w:line="260"/>
             </w:pPr>
             <w:r>
@@ -11521,19 +11586,24 @@
         <w:gridCol w:w="7100"/>
       </w:tblGrid>
       <w:tr>
-        <w:tc>
-          <w:tcPr>
-            <w:tcW w:type="dxa" w:w="2200"/>
-            <w:shd w:fill="F2F2F0" w:color="auto" w:val="clear"/>
-            <w:tcMar>
-              <w:top w:type="dxa" w:w="70"/>
-              <w:left w:type="dxa" w:w="100"/>
-              <w:bottom w:type="dxa" w:w="70"/>
-              <w:right w:type="dxa" w:w="100"/>
-            </w:tcMar>
-          </w:tcPr>
-          <w:p>
-            <w:pPr>
+        <w:trPr>
+          <w:cantSplit/>
+          <w:tblHeader/>
+        </w:trPr>
+        <w:tc>
+          <w:tcPr>
+            <w:tcW w:type="dxa" w:w="2200"/>
+            <w:shd w:fill="F2F2F0" w:color="auto" w:val="clear"/>
+            <w:tcMar>
+              <w:top w:type="dxa" w:w="70"/>
+              <w:left w:type="dxa" w:w="100"/>
+              <w:bottom w:type="dxa" w:w="70"/>
+              <w:right w:type="dxa" w:w="100"/>
+            </w:tcMar>
+          </w:tcPr>
+          <w:p>
+            <w:pPr>
+              <w:keepNext/>
               <w:spacing w:after="0" w:line="260"/>
             </w:pPr>
             <w:r>
@@ -11560,6 +11630,7 @@
           </w:tcPr>
           <w:p>
             <w:pPr>
+              <w:keepNext/>
               <w:spacing w:after="0" w:line="260"/>
             </w:pPr>
             <w:r>
@@ -12308,6 +12379,10 @@
         <w:gridCol w:w="7100"/>
       </w:tblGrid>
       <w:tr>
+        <w:trPr>
+          <w:cantSplit/>
+          <w:tblHeader/>
+        </w:trPr>
         <w:tc>
           <w:tcPr>
             <w:tcW w:type="dxa" w:w="2200"/>
@@ -12321,6 +12396,7 @@
           </w:tcPr>
           <w:p>
             <w:pPr>
+              <w:keepNext/>
               <w:spacing w:after="0" w:line="260"/>
             </w:pPr>
             <w:r>
@@ -12348,6 +12424,7 @@
           </w:tcPr>
           <w:p>
             <w:pPr>
+              <w:keepNext/>
               <w:spacing w:after="0" w:line="260"/>
             </w:pPr>
             <w:r>
@@ -13096,6 +13173,10 @@
         <w:gridCol w:w="7100"/>
       </w:tblGrid>
       <w:tr>
+        <w:trPr>
+          <w:cantSplit/>
+          <w:tblHeader/>
+        </w:trPr>
         <w:tc>
           <w:tcPr>
             <w:tcW w:type="dxa" w:w="2200"/>
@@ -13109,6 +13190,7 @@
           </w:tcPr>
           <w:p>
             <w:pPr>
+              <w:keepNext/>
               <w:spacing w:after="0" w:line="260"/>
             </w:pPr>
             <w:r>
@@ -13136,6 +13218,7 @@
           </w:tcPr>
           <w:p>
             <w:pPr>
+              <w:keepNext/>
               <w:spacing w:after="0" w:line="260"/>
             </w:pPr>
             <w:r>
@@ -13884,6 +13967,10 @@
         <w:gridCol w:w="7100"/>
       </w:tblGrid>
       <w:tr>
+        <w:trPr>
+          <w:cantSplit/>
+          <w:tblHeader/>
+        </w:trPr>
         <w:tc>
           <w:tcPr>
             <w:tcW w:type="dxa" w:w="2200"/>
@@ -13897,6 +13984,7 @@
           </w:tcPr>
           <w:p>
             <w:pPr>
+              <w:keepNext/>
               <w:spacing w:after="0" w:line="260"/>
             </w:pPr>
             <w:r>
@@ -13924,6 +14012,7 @@
           </w:tcPr>
           <w:p>
             <w:pPr>
+              <w:keepNext/>
               <w:spacing w:after="0" w:line="260"/>
             </w:pPr>
             <w:r>
@@ -14672,6 +14761,10 @@
         <w:gridCol w:w="7100"/>
       </w:tblGrid>
       <w:tr>
+        <w:trPr>
+          <w:cantSplit/>
+          <w:tblHeader/>
+        </w:trPr>
         <w:tc>
           <w:tcPr>
             <w:tcW w:type="dxa" w:w="2200"/>
@@ -14685,6 +14778,7 @@
           </w:tcPr>
           <w:p>
             <w:pPr>
+              <w:keepNext/>
               <w:spacing w:after="0" w:line="260"/>
             </w:pPr>
             <w:r>
@@ -14712,6 +14806,7 @@
           </w:tcPr>
           <w:p>
             <w:pPr>
+              <w:keepNext/>
               <w:spacing w:after="0" w:line="260"/>
             </w:pPr>
             <w:r>
@@ -15460,6 +15555,10 @@
         <w:gridCol w:w="7100"/>
       </w:tblGrid>
       <w:tr>
+        <w:trPr>
+          <w:cantSplit/>
+          <w:tblHeader/>
+        </w:trPr>
         <w:tc>
           <w:tcPr>
             <w:tcW w:type="dxa" w:w="2200"/>
@@ -15473,6 +15572,7 @@
           </w:tcPr>
           <w:p>
             <w:pPr>
+              <w:keepNext/>
               <w:spacing w:after="0" w:line="260"/>
             </w:pPr>
             <w:r>
@@ -15500,6 +15600,7 @@
           </w:tcPr>
           <w:p>
             <w:pPr>
+              <w:keepNext/>
               <w:spacing w:after="0" w:line="260"/>
             </w:pPr>
             <w:r>
@@ -16248,6 +16349,10 @@
         <w:gridCol w:w="7100"/>
       </w:tblGrid>
       <w:tr>
+        <w:trPr>
+          <w:cantSplit/>
+          <w:tblHeader/>
+        </w:trPr>
         <w:tc>
           <w:tcPr>
             <w:tcW w:type="dxa" w:w="2200"/>
@@ -16261,6 +16366,7 @@
           </w:tcPr>
           <w:p>
             <w:pPr>
+              <w:keepNext/>
               <w:spacing w:after="0" w:line="260"/>
             </w:pPr>
             <w:r>
@@ -16288,6 +16394,7 @@
           </w:tcPr>
           <w:p>
             <w:pPr>
+              <w:keepNext/>
               <w:spacing w:after="0" w:line="260"/>
             </w:pPr>
             <w:r>
@@ -17036,6 +17143,10 @@
         <w:gridCol w:w="7100"/>
       </w:tblGrid>
       <w:tr>
+        <w:trPr>
+          <w:cantSplit/>
+          <w:tblHeader/>
+        </w:trPr>
         <w:tc>
           <w:tcPr>
             <w:tcW w:type="dxa" w:w="2200"/>
@@ -17049,6 +17160,7 @@
           </w:tcPr>
           <w:p>
             <w:pPr>
+              <w:keepNext/>
               <w:spacing w:after="0" w:line="260"/>
             </w:pPr>
             <w:r>
@@ -17076,6 +17188,7 @@
           </w:tcPr>
           <w:p>
             <w:pPr>
+              <w:keepNext/>
               <w:spacing w:after="0" w:line="260"/>
             </w:pPr>
             <w:r>
@@ -17824,6 +17937,10 @@
         <w:gridCol w:w="7100"/>
       </w:tblGrid>
       <w:tr>
+        <w:trPr>
+          <w:cantSplit/>
+          <w:tblHeader/>
+        </w:trPr>
         <w:tc>
           <w:tcPr>
             <w:tcW w:type="dxa" w:w="2200"/>
@@ -17837,6 +17954,7 @@
           </w:tcPr>
           <w:p>
             <w:pPr>
+              <w:keepNext/>
               <w:spacing w:after="0" w:line="260"/>
             </w:pPr>
             <w:r>
@@ -17864,6 +17982,7 @@
           </w:tcPr>
           <w:p>
             <w:pPr>
+              <w:keepNext/>
               <w:spacing w:after="0" w:line="260"/>
             </w:pPr>
             <w:r>
@@ -18612,6 +18731,10 @@
         <w:gridCol w:w="7100"/>
       </w:tblGrid>
       <w:tr>
+        <w:trPr>
+          <w:cantSplit/>
+          <w:tblHeader/>
+        </w:trPr>
         <w:tc>
           <w:tcPr>
             <w:tcW w:type="dxa" w:w="2200"/>
@@ -18625,6 +18748,7 @@
           </w:tcPr>
           <w:p>
             <w:pPr>
+              <w:keepNext/>
               <w:spacing w:after="0" w:line="260"/>
             </w:pPr>
             <w:r>
@@ -18652,6 +18776,7 @@
           </w:tcPr>
           <w:p>
             <w:pPr>
+              <w:keepNext/>
               <w:spacing w:after="0" w:line="260"/>
             </w:pPr>
             <w:r>
@@ -19400,6 +19525,10 @@
         <w:gridCol w:w="7100"/>
       </w:tblGrid>
       <w:tr>
+        <w:trPr>
+          <w:cantSplit/>
+          <w:tblHeader/>
+        </w:trPr>
         <w:tc>
           <w:tcPr>
             <w:tcW w:type="dxa" w:w="2200"/>
@@ -19413,6 +19542,7 @@
           </w:tcPr>
           <w:p>
             <w:pPr>
+              <w:keepNext/>
               <w:spacing w:after="0" w:line="260"/>
             </w:pPr>
             <w:r>
@@ -19440,6 +19570,7 @@
           </w:tcPr>
           <w:p>
             <w:pPr>
+              <w:keepNext/>
               <w:spacing w:after="0" w:line="260"/>
             </w:pPr>
             <w:r>
@@ -20188,6 +20319,10 @@
         <w:gridCol w:w="7100"/>
       </w:tblGrid>
       <w:tr>
+        <w:trPr>
+          <w:cantSplit/>
+          <w:tblHeader/>
+        </w:trPr>
         <w:tc>
           <w:tcPr>
             <w:tcW w:type="dxa" w:w="2200"/>
@@ -20201,6 +20336,7 @@
           </w:tcPr>
           <w:p>
             <w:pPr>
+              <w:keepNext/>
               <w:spacing w:after="0" w:line="260"/>
             </w:pPr>
             <w:r>
@@ -20228,6 +20364,7 @@
           </w:tcPr>
           <w:p>
             <w:pPr>
+              <w:keepNext/>
               <w:spacing w:after="0" w:line="260"/>
             </w:pPr>
             <w:r>
@@ -20976,6 +21113,10 @@
         <w:gridCol w:w="7100"/>
       </w:tblGrid>
       <w:tr>
+        <w:trPr>
+          <w:cantSplit/>
+          <w:tblHeader/>
+        </w:trPr>
         <w:tc>
           <w:tcPr>
             <w:tcW w:type="dxa" w:w="2200"/>
@@ -20989,6 +21130,7 @@
           </w:tcPr>
           <w:p>
             <w:pPr>
+              <w:keepNext/>
               <w:spacing w:after="0" w:line="260"/>
             </w:pPr>
             <w:r>
@@ -21016,6 +21158,7 @@
           </w:tcPr>
           <w:p>
             <w:pPr>
+              <w:keepNext/>
               <w:spacing w:after="0" w:line="260"/>
             </w:pPr>
             <w:r>
@@ -21764,19 +21907,24 @@
         <w:gridCol w:w="7100"/>
       </w:tblGrid>
       <w:tr>
-        <w:tc>
-          <w:tcPr>
-            <w:tcW w:type="dxa" w:w="2200"/>
-            <w:shd w:fill="F2F2F0" w:color="auto" w:val="clear"/>
-            <w:tcMar>
-              <w:top w:type="dxa" w:w="70"/>
-              <w:left w:type="dxa" w:w="100"/>
-              <w:bottom w:type="dxa" w:w="70"/>
-              <w:right w:type="dxa" w:w="100"/>
-            </w:tcMar>
-          </w:tcPr>
-          <w:p>
-            <w:pPr>
+        <w:trPr>
+          <w:cantSplit/>
+          <w:tblHeader/>
+        </w:trPr>
+        <w:tc>
+          <w:tcPr>
+            <w:tcW w:type="dxa" w:w="2200"/>
+            <w:shd w:fill="F2F2F0" w:color="auto" w:val="clear"/>
+            <w:tcMar>
+              <w:top w:type="dxa" w:w="70"/>
+              <w:left w:type="dxa" w:w="100"/>
+              <w:bottom w:type="dxa" w:w="70"/>
+              <w:right w:type="dxa" w:w="100"/>
+            </w:tcMar>
+          </w:tcPr>
+          <w:p>
+            <w:pPr>
+              <w:keepNext/>
               <w:spacing w:after="0" w:line="260"/>
             </w:pPr>
             <w:r>
@@ -21803,6 +21951,7 @@
           </w:tcPr>
           <w:p>
             <w:pPr>
+              <w:keepNext/>
               <w:spacing w:after="0" w:line="260"/>
             </w:pPr>
             <w:r>
@@ -22551,6 +22700,10 @@
         <w:gridCol w:w="7100"/>
       </w:tblGrid>
       <w:tr>
+        <w:trPr>
+          <w:cantSplit/>
+          <w:tblHeader/>
+        </w:trPr>
         <w:tc>
           <w:tcPr>
             <w:tcW w:type="dxa" w:w="2200"/>
@@ -22564,6 +22717,7 @@
           </w:tcPr>
           <w:p>
             <w:pPr>
+              <w:keepNext/>
               <w:spacing w:after="0" w:line="260"/>
             </w:pPr>
             <w:r>
@@ -22591,6 +22745,7 @@
           </w:tcPr>
           <w:p>
             <w:pPr>
+              <w:keepNext/>
               <w:spacing w:after="0" w:line="260"/>
             </w:pPr>
             <w:r>
@@ -23339,19 +23494,24 @@
         <w:gridCol w:w="7100"/>
       </w:tblGrid>
       <w:tr>
-        <w:tc>
-          <w:tcPr>
-            <w:tcW w:type="dxa" w:w="2200"/>
-            <w:shd w:fill="F2F2F0" w:color="auto" w:val="clear"/>
-            <w:tcMar>
-              <w:top w:type="dxa" w:w="70"/>
-              <w:left w:type="dxa" w:w="100"/>
-              <w:bottom w:type="dxa" w:w="70"/>
-              <w:right w:type="dxa" w:w="100"/>
-            </w:tcMar>
-          </w:tcPr>
-          <w:p>
-            <w:pPr>
+        <w:trPr>
+          <w:cantSplit/>
+          <w:tblHeader/>
+        </w:trPr>
+        <w:tc>
+          <w:tcPr>
+            <w:tcW w:type="dxa" w:w="2200"/>
+            <w:shd w:fill="F2F2F0" w:color="auto" w:val="clear"/>
+            <w:tcMar>
+              <w:top w:type="dxa" w:w="70"/>
+              <w:left w:type="dxa" w:w="100"/>
+              <w:bottom w:type="dxa" w:w="70"/>
+              <w:right w:type="dxa" w:w="100"/>
+            </w:tcMar>
+          </w:tcPr>
+          <w:p>
+            <w:pPr>
+              <w:keepNext/>
               <w:spacing w:after="0" w:line="260"/>
             </w:pPr>
             <w:r>
@@ -23378,6 +23538,7 @@
           </w:tcPr>
           <w:p>
             <w:pPr>
+              <w:keepNext/>
               <w:spacing w:after="0" w:line="260"/>
             </w:pPr>
             <w:r>
@@ -24126,19 +24287,24 @@
         <w:gridCol w:w="7100"/>
       </w:tblGrid>
       <w:tr>
-        <w:tc>
-          <w:tcPr>
-            <w:tcW w:type="dxa" w:w="2200"/>
-            <w:shd w:fill="F2F2F0" w:color="auto" w:val="clear"/>
-            <w:tcMar>
-              <w:top w:type="dxa" w:w="70"/>
-              <w:left w:type="dxa" w:w="100"/>
-              <w:bottom w:type="dxa" w:w="70"/>
-              <w:right w:type="dxa" w:w="100"/>
-            </w:tcMar>
-          </w:tcPr>
-          <w:p>
-            <w:pPr>
+        <w:trPr>
+          <w:cantSplit/>
+          <w:tblHeader/>
+        </w:trPr>
+        <w:tc>
+          <w:tcPr>
+            <w:tcW w:type="dxa" w:w="2200"/>
+            <w:shd w:fill="F2F2F0" w:color="auto" w:val="clear"/>
+            <w:tcMar>
+              <w:top w:type="dxa" w:w="70"/>
+              <w:left w:type="dxa" w:w="100"/>
+              <w:bottom w:type="dxa" w:w="70"/>
+              <w:right w:type="dxa" w:w="100"/>
+            </w:tcMar>
+          </w:tcPr>
+          <w:p>
+            <w:pPr>
+              <w:keepNext/>
               <w:spacing w:after="0" w:line="260"/>
             </w:pPr>
             <w:r>
@@ -24165,6 +24331,7 @@
           </w:tcPr>
           <w:p>
             <w:pPr>
+              <w:keepNext/>
               <w:spacing w:after="0" w:line="260"/>
             </w:pPr>
             <w:r>
@@ -24913,19 +25080,24 @@
         <w:gridCol w:w="7100"/>
       </w:tblGrid>
       <w:tr>
-        <w:tc>
-          <w:tcPr>
-            <w:tcW w:type="dxa" w:w="2200"/>
-            <w:shd w:fill="F2F2F0" w:color="auto" w:val="clear"/>
-            <w:tcMar>
-              <w:top w:type="dxa" w:w="70"/>
-              <w:left w:type="dxa" w:w="100"/>
-              <w:bottom w:type="dxa" w:w="70"/>
-              <w:right w:type="dxa" w:w="100"/>
-            </w:tcMar>
-          </w:tcPr>
-          <w:p>
-            <w:pPr>
+        <w:trPr>
+          <w:cantSplit/>
+          <w:tblHeader/>
+        </w:trPr>
+        <w:tc>
+          <w:tcPr>
+            <w:tcW w:type="dxa" w:w="2200"/>
+            <w:shd w:fill="F2F2F0" w:color="auto" w:val="clear"/>
+            <w:tcMar>
+              <w:top w:type="dxa" w:w="70"/>
+              <w:left w:type="dxa" w:w="100"/>
+              <w:bottom w:type="dxa" w:w="70"/>
+              <w:right w:type="dxa" w:w="100"/>
+            </w:tcMar>
+          </w:tcPr>
+          <w:p>
+            <w:pPr>
+              <w:keepNext/>
               <w:spacing w:after="0" w:line="260"/>
             </w:pPr>
             <w:r>
@@ -24952,6 +25124,7 @@
           </w:tcPr>
           <w:p>
             <w:pPr>
+              <w:keepNext/>
               <w:spacing w:after="0" w:line="260"/>
             </w:pPr>
             <w:r>
@@ -25700,19 +25873,24 @@
         <w:gridCol w:w="7100"/>
       </w:tblGrid>
       <w:tr>
-        <w:tc>
-          <w:tcPr>
-            <w:tcW w:type="dxa" w:w="2200"/>
-            <w:shd w:fill="F2F2F0" w:color="auto" w:val="clear"/>
-            <w:tcMar>
-              <w:top w:type="dxa" w:w="70"/>
-              <w:left w:type="dxa" w:w="100"/>
-              <w:bottom w:type="dxa" w:w="70"/>
-              <w:right w:type="dxa" w:w="100"/>
-            </w:tcMar>
-          </w:tcPr>
-          <w:p>
-            <w:pPr>
+        <w:trPr>
+          <w:cantSplit/>
+          <w:tblHeader/>
+        </w:trPr>
+        <w:tc>
+          <w:tcPr>
+            <w:tcW w:type="dxa" w:w="2200"/>
+            <w:shd w:fill="F2F2F0" w:color="auto" w:val="clear"/>
+            <w:tcMar>
+              <w:top w:type="dxa" w:w="70"/>
+              <w:left w:type="dxa" w:w="100"/>
+              <w:bottom w:type="dxa" w:w="70"/>
+              <w:right w:type="dxa" w:w="100"/>
+            </w:tcMar>
+          </w:tcPr>
+          <w:p>
+            <w:pPr>
+              <w:keepNext/>
               <w:spacing w:after="0" w:line="260"/>
             </w:pPr>
             <w:r>
@@ -25739,6 +25917,7 @@
           </w:tcPr>
           <w:p>
             <w:pPr>
+              <w:keepNext/>
               <w:spacing w:after="0" w:line="260"/>
             </w:pPr>
             <w:r>
@@ -26487,19 +26666,24 @@
         <w:gridCol w:w="7100"/>
       </w:tblGrid>
       <w:tr>
-        <w:tc>
-          <w:tcPr>
-            <w:tcW w:type="dxa" w:w="2200"/>
-            <w:shd w:fill="F2F2F0" w:color="auto" w:val="clear"/>
-            <w:tcMar>
-              <w:top w:type="dxa" w:w="70"/>
-              <w:left w:type="dxa" w:w="100"/>
-              <w:bottom w:type="dxa" w:w="70"/>
-              <w:right w:type="dxa" w:w="100"/>
-            </w:tcMar>
-          </w:tcPr>
-          <w:p>
-            <w:pPr>
+        <w:trPr>
+          <w:cantSplit/>
+          <w:tblHeader/>
+        </w:trPr>
+        <w:tc>
+          <w:tcPr>
+            <w:tcW w:type="dxa" w:w="2200"/>
+            <w:shd w:fill="F2F2F0" w:color="auto" w:val="clear"/>
+            <w:tcMar>
+              <w:top w:type="dxa" w:w="70"/>
+              <w:left w:type="dxa" w:w="100"/>
+              <w:bottom w:type="dxa" w:w="70"/>
+              <w:right w:type="dxa" w:w="100"/>
+            </w:tcMar>
+          </w:tcPr>
+          <w:p>
+            <w:pPr>
+              <w:keepNext/>
               <w:spacing w:after="0" w:line="260"/>
             </w:pPr>
             <w:r>
@@ -26526,6 +26710,7 @@
           </w:tcPr>
           <w:p>
             <w:pPr>
+              <w:keepNext/>
               <w:spacing w:after="0" w:line="260"/>
             </w:pPr>
             <w:r>
@@ -27274,19 +27459,24 @@
         <w:gridCol w:w="7100"/>
       </w:tblGrid>
       <w:tr>
-        <w:tc>
-          <w:tcPr>
-            <w:tcW w:type="dxa" w:w="2200"/>
-            <w:shd w:fill="F2F2F0" w:color="auto" w:val="clear"/>
-            <w:tcMar>
-              <w:top w:type="dxa" w:w="70"/>
-              <w:left w:type="dxa" w:w="100"/>
-              <w:bottom w:type="dxa" w:w="70"/>
-              <w:right w:type="dxa" w:w="100"/>
-            </w:tcMar>
-          </w:tcPr>
-          <w:p>
-            <w:pPr>
+        <w:trPr>
+          <w:cantSplit/>
+          <w:tblHeader/>
+        </w:trPr>
+        <w:tc>
+          <w:tcPr>
+            <w:tcW w:type="dxa" w:w="2200"/>
+            <w:shd w:fill="F2F2F0" w:color="auto" w:val="clear"/>
+            <w:tcMar>
+              <w:top w:type="dxa" w:w="70"/>
+              <w:left w:type="dxa" w:w="100"/>
+              <w:bottom w:type="dxa" w:w="70"/>
+              <w:right w:type="dxa" w:w="100"/>
+            </w:tcMar>
+          </w:tcPr>
+          <w:p>
+            <w:pPr>
+              <w:keepNext/>
               <w:spacing w:after="0" w:line="260"/>
             </w:pPr>
             <w:r>
@@ -27313,6 +27503,7 @@
           </w:tcPr>
           <w:p>
             <w:pPr>
+              <w:keepNext/>
               <w:spacing w:after="0" w:line="260"/>
             </w:pPr>
             <w:r>
@@ -28061,6 +28252,10 @@
         <w:gridCol w:w="7100"/>
       </w:tblGrid>
       <w:tr>
+        <w:trPr>
+          <w:cantSplit/>
+          <w:tblHeader/>
+        </w:trPr>
         <w:tc>
           <w:tcPr>
             <w:tcW w:type="dxa" w:w="2200"/>
@@ -28074,6 +28269,7 @@
           </w:tcPr>
           <w:p>
             <w:pPr>
+              <w:keepNext/>
               <w:spacing w:after="0" w:line="260"/>
             </w:pPr>
             <w:r>
@@ -28101,6 +28297,7 @@
           </w:tcPr>
           <w:p>
             <w:pPr>
+              <w:keepNext/>
               <w:spacing w:after="0" w:line="260"/>
             </w:pPr>
             <w:r>
@@ -28849,6 +29046,10 @@
         <w:gridCol w:w="7100"/>
       </w:tblGrid>
       <w:tr>
+        <w:trPr>
+          <w:cantSplit/>
+          <w:tblHeader/>
+        </w:trPr>
         <w:tc>
           <w:tcPr>
             <w:tcW w:type="dxa" w:w="2200"/>
@@ -28862,6 +29063,7 @@
           </w:tcPr>
           <w:p>
             <w:pPr>
+              <w:keepNext/>
               <w:spacing w:after="0" w:line="260"/>
             </w:pPr>
             <w:r>
@@ -28889,6 +29091,7 @@
           </w:tcPr>
           <w:p>
             <w:pPr>
+              <w:keepNext/>
               <w:spacing w:after="0" w:line="260"/>
             </w:pPr>
             <w:r>
@@ -29637,6 +29840,10 @@
         <w:gridCol w:w="7100"/>
       </w:tblGrid>
       <w:tr>
+        <w:trPr>
+          <w:cantSplit/>
+          <w:tblHeader/>
+        </w:trPr>
         <w:tc>
           <w:tcPr>
             <w:tcW w:type="dxa" w:w="2200"/>
@@ -29650,6 +29857,7 @@
           </w:tcPr>
           <w:p>
             <w:pPr>
+              <w:keepNext/>
               <w:spacing w:after="0" w:line="260"/>
             </w:pPr>
             <w:r>
@@ -29677,6 +29885,7 @@
           </w:tcPr>
           <w:p>
             <w:pPr>
+              <w:keepNext/>
               <w:spacing w:after="0" w:line="260"/>
             </w:pPr>
             <w:r>
@@ -30425,6 +30634,10 @@
         <w:gridCol w:w="7100"/>
       </w:tblGrid>
       <w:tr>
+        <w:trPr>
+          <w:cantSplit/>
+          <w:tblHeader/>
+        </w:trPr>
         <w:tc>
           <w:tcPr>
             <w:tcW w:type="dxa" w:w="2200"/>
@@ -30438,6 +30651,7 @@
           </w:tcPr>
           <w:p>
             <w:pPr>
+              <w:keepNext/>
               <w:spacing w:after="0" w:line="260"/>
             </w:pPr>
             <w:r>
@@ -30465,6 +30679,7 @@
           </w:tcPr>
           <w:p>
             <w:pPr>
+              <w:keepNext/>
               <w:spacing w:after="0" w:line="260"/>
             </w:pPr>
             <w:r>
@@ -31213,6 +31428,10 @@
         <w:gridCol w:w="7100"/>
       </w:tblGrid>
       <w:tr>
+        <w:trPr>
+          <w:cantSplit/>
+          <w:tblHeader/>
+        </w:trPr>
         <w:tc>
           <w:tcPr>
             <w:tcW w:type="dxa" w:w="2200"/>
@@ -31226,6 +31445,7 @@
           </w:tcPr>
           <w:p>
             <w:pPr>
+              <w:keepNext/>
               <w:spacing w:after="0" w:line="260"/>
             </w:pPr>
             <w:r>
@@ -31253,6 +31473,7 @@
           </w:tcPr>
           <w:p>
             <w:pPr>
+              <w:keepNext/>
               <w:spacing w:after="0" w:line="260"/>
             </w:pPr>
             <w:r>
@@ -32001,6 +32222,10 @@
         <w:gridCol w:w="7100"/>
       </w:tblGrid>
       <w:tr>
+        <w:trPr>
+          <w:cantSplit/>
+          <w:tblHeader/>
+        </w:trPr>
         <w:tc>
           <w:tcPr>
             <w:tcW w:type="dxa" w:w="2200"/>
@@ -32014,6 +32239,7 @@
           </w:tcPr>
           <w:p>
             <w:pPr>
+              <w:keepNext/>
               <w:spacing w:after="0" w:line="260"/>
             </w:pPr>
             <w:r>
@@ -32041,6 +32267,7 @@
           </w:tcPr>
           <w:p>
             <w:pPr>
+              <w:keepNext/>
               <w:spacing w:after="0" w:line="260"/>
             </w:pPr>
             <w:r>
@@ -32789,6 +33016,10 @@
         <w:gridCol w:w="7100"/>
       </w:tblGrid>
       <w:tr>
+        <w:trPr>
+          <w:cantSplit/>
+          <w:tblHeader/>
+        </w:trPr>
         <w:tc>
           <w:tcPr>
             <w:tcW w:type="dxa" w:w="2200"/>
@@ -32802,6 +33033,7 @@
           </w:tcPr>
           <w:p>
             <w:pPr>
+              <w:keepNext/>
               <w:spacing w:after="0" w:line="260"/>
             </w:pPr>
             <w:r>
@@ -32829,6 +33061,7 @@
           </w:tcPr>
           <w:p>
             <w:pPr>
+              <w:keepNext/>
               <w:spacing w:after="0" w:line="260"/>
             </w:pPr>
             <w:r>
@@ -35382,6 +35615,10 @@
         <w:gridCol w:w="3300"/>
       </w:tblGrid>
       <w:tr>
+        <w:trPr>
+          <w:cantSplit/>
+          <w:tblHeader/>
+        </w:trPr>
         <w:tc>
           <w:tcPr>
             <w:tcW w:type="dxa" w:w="900"/>
@@ -35395,6 +35632,7 @@
           </w:tcPr>
           <w:p>
             <w:pPr>
+              <w:keepNext/>
               <w:spacing w:after="0" w:line="260"/>
             </w:pPr>
             <w:r>
@@ -35423,6 +35661,7 @@
           </w:tcPr>
           <w:p>
             <w:pPr>
+              <w:keepNext/>
               <w:spacing w:after="0" w:line="260"/>
             </w:pPr>
             <w:r>
@@ -35451,6 +35690,7 @@
           </w:tcPr>
           <w:p>
             <w:pPr>
+              <w:keepNext/>
               <w:spacing w:after="0" w:line="260"/>
             </w:pPr>
             <w:r>
@@ -35479,6 +35719,7 @@
           </w:tcPr>
           <w:p>
             <w:pPr>
+              <w:keepNext/>
               <w:spacing w:after="0" w:line="260"/>
             </w:pPr>
             <w:r>

</xml_diff>